<commit_message>
Added API credit usage
</commit_message>
<xml_diff>
--- a/ai_usage.docx
+++ b/ai_usage.docx
@@ -252,6 +252,26 @@
           <w:szCs w:val="22"/>
         </w:rPr>
         <w:t>The output along with the RAG retrieval was then reinputted to the model along to provide a readable and searchable triage decision report.</w:t>
+      </w:r>
+    </w:p>
+    <w:p>
+      <w:pPr>
+        <w:pStyle w:val="ListParagraph"/>
+        <w:numPr>
+          <w:ilvl w:val="0"/>
+          <w:numId w:val="1"/>
+        </w:numPr>
+        <w:rPr>
+          <w:sz w:val="22"/>
+          <w:szCs w:val="22"/>
+        </w:rPr>
+      </w:pPr>
+      <w:r>
+        <w:rPr>
+          <w:sz w:val="22"/>
+          <w:szCs w:val="22"/>
+        </w:rPr>
+        <w:t xml:space="preserve">A total of $0.53 of Anthropic API credits was used for testing. </w:t>
       </w:r>
     </w:p>
     <w:p>
@@ -989,6 +1009,7 @@
   <w:style w:type="character" w:default="1" w:styleId="DefaultParagraphFont">
     <w:name w:val="Default Paragraph Font"/>
     <w:uiPriority w:val="1"/>
+    <w:semiHidden/>
     <w:unhideWhenUsed/>
   </w:style>
   <w:style w:type="table" w:default="1" w:styleId="TableNormal">

</xml_diff>